<commit_message>
thesis: polish final figures and evidence claims
</commit_message>
<xml_diff>
--- a/thesis_latex/FYP_FINAL.docx
+++ b/thesis_latex/FYP_FINAL.docx
@@ -17999,7 +17999,7 @@
         <w:rPr>
           <w:rFonts w:ascii="Times New Roman" w:hAnsi="Times New Roman" w:cs="Times New Roman"/>
         </w:rPr>
-        <w:t xml:space="preserve">targeting the xc7a100tfgg484-2 device on the Davinci Pro A7-100T board </w:t>
+        <w:t xml:space="preserve">targeting the xc7a100t device on the Davinci Pro A7-100T board </w:t>
       </w:r>
       <w:r>
         <w:rPr>
@@ -18392,7 +18392,7 @@
               <w:jc w:val="center"/>
             </w:pPr>
             <w:r>
-              <w:t xml:space="preserve">0.061</w:t>
+              <w:t xml:space="preserve">0.058</w:t>
             </w:r>
           </w:p>
         </w:tc>
@@ -18630,7 +18630,7 @@
               <w:jc w:val="center"/>
             </w:pPr>
             <w:r>
-              <w:t xml:space="preserve">12.468</w:t>
+              <w:t xml:space="preserve">12.472</w:t>
             </w:r>
           </w:p>
         </w:tc>
@@ -18716,7 +18716,7 @@
         <w:rPr>
           <w:rFonts w:ascii="Times New Roman" w:hAnsi="Times New Roman" w:cs="Times New Roman"/>
         </w:rPr>
-        <w:t>), featuring a Xilinx Artix-7 xc7a100tfgg484-2 FPGA, serves as the hardware validation platform. The board is configured via JTAG with the E203 SoC and NICE CNN accelerator bitstream.</w:t>
+        <w:t>), featuring a Xilinx Artix-7 xc7a100t FPGA, serves as the hardware validation platform. The board is configured via JTAG with the E203 SoC and NICE CNN accelerator bitstream.</w:t>
       </w:r>
     </w:p>
     <w:bookmarkStart w:id="115" w:name="fig:fpga_board"/>
@@ -18738,7 +18738,7 @@
         <w:rPr>
           <w:rFonts w:ascii="Times New Roman" w:hAnsi="Times New Roman" w:cs="Times New Roman"/>
         </w:rPr>
-        <w:t>Davinci Pro A7-100T FPGA development board running the LeNet-5 CNN inference demo.</w:t>
+        <w:t>Davinci Pro A7-100T FPGA development board used for E203 SoC and NICE CNN accelerator validation.</w:t>
       </w:r>
     </w:p>
     <w:bookmarkEnd w:id="115"/>
@@ -20975,73 +20975,27 @@
         <w:rPr>
           <w:rFonts w:ascii="Times New Roman" w:hAnsi="Times New Roman" w:cs="Times New Roman"/>
         </w:rPr>
-        <w:t>On the FPGA platform, ILA probe traces confirmed the NICE instruction execution sequence. The CPU executes CLEAR, four WLOADs, four DLOADs, COMP, and RSTAT before reaching program completion. The full LeNet-5 inference pipeline was deployed and tested on 10 MNIST test images.</w:t>
-      </w:r>
-    </w:p>
-    <w:bookmarkStart w:id="144" w:name="fig:uart_output"/>
-    <w:p>
-      <w:pPr>
-        <w:pStyle w:val="CaptionedFigure"/>
-      </w:pPr>
-      <w:r>
-        <w:rPr>
-          <w:rFonts w:ascii="Times New Roman" w:hAnsi="Times New Roman" w:cs="Times New Roman"/>
-        </w:rPr>
-      </w:r>
-    </w:p>
-    <w:p>
-      <w:pPr>
-        <w:pStyle w:val="ImageCaption"/>
-      </w:pPr>
-      <w:r>
-        <w:rPr>
-          <w:rFonts w:ascii="Times New Roman" w:hAnsi="Times New Roman" w:cs="Times New Roman"/>
-        </w:rPr>
-        <w:t>UART terminal output from the LeNet-5 MNIST inference demo running on the FPGA. The system correctly classified all 10 of 10 test images (100%), confirming end-to-end functionality of the NICE-accelerated inference pipeline with INT8-quantized weights achieving 98.34% accuracy on the full MNIST test set (10,000 images). Two key corrections enabled this result: (1) fixing the Conv2 multi-channel ReLU timing to apply activation after channel summation rather than per-channel, and (2) using per-layer calibrated rescaling factors (generated by the Python quantization toolchain) for Conv2-to-FC1 input rescaling and FC layer output right-shift operations.</w:t>
-      </w:r>
-    </w:p>
-    <w:bookmarkEnd w:id="144"/>
-    <w:p>
-      <w:pPr>
-        <w:pStyle w:val="BodyText"/>
-        <w:spacing w:line="360" w:lineRule="auto"/>
-        <w:jc w:val="both"/>
-      </w:pPr>
-      <w:r>
-        <w:rPr>
-          <w:rFonts w:ascii="Times New Roman" w:hAnsi="Times New Roman" w:cs="Times New Roman"/>
-        </w:rPr>
-        <w:t xml:space="preserve">The measured 98.34% inference accuracy represents only a 1.7% degradation from the FP32 baseline </w:t>
-      </w:r>
-      <w:r>
-        <w:rPr>
-          <w:rFonts w:ascii="Times New Roman" w:hAnsi="Times New Roman" w:cs="Times New Roman"/>
-        </w:rPr>
-        <w:t>[10]</w:t>
-      </w:r>
-      <w:r>
-        <w:rPr>
-          <w:rFonts w:ascii="Times New Roman" w:hAnsi="Times New Roman" w:cs="Times New Roman"/>
-        </w:rPr>
-        <w:t xml:space="preserve"> </w:t>
-      </w:r>
-      <w:r>
-        <w:rPr>
-          <w:rFonts w:ascii="Times New Roman" w:hAnsi="Times New Roman" w:cs="Times New Roman"/>
-        </w:rPr>
-        <w:t xml:space="preserve">(98.5%), well within the project’s 5% accuracy loss target and comparable to state-of-the-art INT8 quantization results </w:t>
-      </w:r>
-      <w:r>
-        <w:rPr>
-          <w:rFonts w:ascii="Times New Roman" w:hAnsi="Times New Roman" w:cs="Times New Roman"/>
-        </w:rPr>
-        <w:t>[12]</w:t>
-      </w:r>
-      <w:r>
-        <w:rPr>
-          <w:rFonts w:ascii="Times New Roman" w:hAnsi="Times New Roman" w:cs="Times New Roman"/>
-        </w:rPr>
-        <w:t>. This result was achieved after correcting two implementation issues. First, the Conv2 multi-channel convolution originally applied ReLU on a per-input-channel basis before summing contributions across channels; moving the ReLU to after channel summation restores negative-value cancellation across channels—a critical property for multi-channel convolution. Second, per-layer calibrated rescaling factors (generated by a Python quantization calibration script) replaced a set of uniform hard-coded shift values, correcting a 2–4</w:t>
+        <w:t xml:space="preserve">On the FPGA platform, ILA probe traces confirmed the NICE instruction execution sequence. The CPU executes CLEAR, four WLOADs, four DLOADs, COMP, and RSTAT before reaching program completion. The UART evidence in Figure </w:t>
+      </w:r>
+      <w:hyperlink w:anchor="fig:uart_output">
+        <w:r>
+          <w:rPr>
+            <w:rStyle w:val="Hyperlink"/>
+          </w:rPr>
+          <w:t xml:space="preserve">4.4</w:t>
+        </w:r>
+      </w:hyperlink>
+      <w:r>
+        <w:rPr>
+          <w:rFonts w:ascii="Times New Roman" w:hAnsi="Times New Roman" w:cs="Times New Roman"/>
+        </w:rPr>
+        <w:t xml:space="preserve"> </w:t>
+      </w:r>
+      <w:r>
+        <w:rPr>
+          <w:rFonts w:ascii="Times New Roman" w:hAnsi="Times New Roman" w:cs="Times New Roman"/>
+        </w:rPr>
+        <w:t>records the reduced CNN v1 board regression used for hardware/software equivalence and cycle-count measurement: a 3</w:t>
       </w:r>
       <m:oMath>
         <m:r>
@@ -21055,19 +21009,7 @@
         <w:rPr>
           <w:rFonts w:ascii="Times New Roman" w:hAnsi="Times New Roman" w:cs="Times New Roman"/>
         </w:rPr>
-        <w:t xml:space="preserve"> </w:t>
-      </w:r>
-      <w:r>
-        <w:rPr>
-          <w:rFonts w:ascii="Times New Roman" w:hAnsi="Times New Roman" w:cs="Times New Roman"/>
-        </w:rPr>
-        <w:t>magnitude mismatch in FC layer outputs. The convolutional layers (Conv1 and Conv2), executed entirely in INT8 via the NICE accelerator, produced numerically correct results verified by per-pixel CPU reference equivalence checks embedded in the firmware. The FC layers perform INT8-weight</w:t>
-      </w:r>
-      <w:r>
-        <w:rPr>
-          <w:rFonts w:ascii="Times New Roman" w:hAnsi="Times New Roman" w:cs="Times New Roman"/>
-        </w:rPr>
-        <w:t xml:space="preserve"> </w:t>
+        <w:t>3 INT8 convolution over a 4</w:t>
       </w:r>
       <m:oMath>
         <m:r>
@@ -21081,57 +21023,29 @@
         <w:rPr>
           <w:rFonts w:ascii="Times New Roman" w:hAnsi="Times New Roman" w:cs="Times New Roman"/>
         </w:rPr>
-        <w:t xml:space="preserve"> </w:t>
-      </w:r>
-      <w:r>
-        <w:rPr>
-          <w:rFonts w:ascii="Times New Roman" w:hAnsi="Times New Roman" w:cs="Times New Roman"/>
-        </w:rPr>
-        <w:t>INT32-activation multiplication with INT64 accumulation and calibrated right-shift rescaling, achieving accuracy within 1.7% of the FP32 reference.</w:t>
-      </w:r>
-    </w:p>
-    <w:bookmarkEnd w:id="145"/>
-    <w:bookmarkEnd w:id="146"/>
-    <w:bookmarkStart w:id="151" w:name="performance-measurement"/>
-    <w:p>
-      <w:pPr>
-        <w:pStyle w:val="Heading3"/>
-        <w:spacing w:line="360" w:lineRule="auto"/>
-      </w:pPr>
-      <w:r>
-        <w:rPr>
-          <w:rStyle w:val="SectionNumber"/>
-          <w:rFonts w:ascii="Times New Roman" w:hAnsi="Times New Roman" w:cs="Times New Roman"/>
-          <w:sz w:val="26"/>
-        </w:rPr>
-        <w:t>4.5.5</w:t>
-      </w:r>
-      <w:r>
-        <w:rPr>
-          <w:rFonts w:ascii="Times New Roman" w:hAnsi="Times New Roman" w:cs="Times New Roman"/>
-          <w:sz w:val="26"/>
-        </w:rPr>
-        <w:tab/>
-      </w:r>
-      <w:r>
-        <w:rPr>
-          <w:rFonts w:ascii="Times New Roman" w:hAnsi="Times New Roman" w:cs="Times New Roman"/>
-          <w:sz w:val="26"/>
-        </w:rPr>
-        <w:t>Performance Measurement</w:t>
-      </w:r>
-    </w:p>
-    <w:p>
-      <w:pPr>
-        <w:pStyle w:val="FirstParagraph"/>
-        <w:spacing w:line="360" w:lineRule="auto"/>
-        <w:jc w:val="both"/>
-      </w:pPr>
-      <w:r>
-        <w:rPr>
-          <w:rFonts w:ascii="Times New Roman" w:hAnsi="Times New Roman" w:cs="Times New Roman"/>
-        </w:rPr>
-        <w:t>The NICE-accelerated convolution was benchmarked against a pure software reference implementation. For a 3</w:t>
+        <w:t>4 INT8 input.</w:t>
+      </w:r>
+    </w:p>
+    <w:bookmarkStart w:id="144" w:name="fig:uart_output"/>
+    <w:p>
+      <w:pPr>
+        <w:pStyle w:val="CaptionedFigure"/>
+      </w:pPr>
+      <w:r>
+        <w:rPr>
+          <w:rFonts w:ascii="Times New Roman" w:hAnsi="Times New Roman" w:cs="Times New Roman"/>
+        </w:rPr>
+      </w:r>
+    </w:p>
+    <w:p>
+      <w:pPr>
+        <w:pStyle w:val="ImageCaption"/>
+      </w:pPr>
+      <w:r>
+        <w:rPr>
+          <w:rFonts w:ascii="Times New Roman" w:hAnsi="Times New Roman" w:cs="Times New Roman"/>
+        </w:rPr>
+        <w:t>UART terminal output from the CNN v1 board regression running on the FPGA. The recorded serial log shows the CPU reference, NICE hardware output, and expected output all matching as 12, 23, 0, 19; the same log reports 287 accelerator cycles versus 1,516 CPU cycles, giving a measured 5.282</w:t>
       </w:r>
       <m:oMath>
         <m:r>
@@ -21145,7 +21059,27 @@
         <w:rPr>
           <w:rFonts w:ascii="Times New Roman" w:hAnsi="Times New Roman" w:cs="Times New Roman"/>
         </w:rPr>
-        <w:t>3 convolution on a 4</w:t>
+        <w:t xml:space="preserve"> </w:t>
+      </w:r>
+      <w:r>
+        <w:rPr>
+          <w:rFonts w:ascii="Times New Roman" w:hAnsi="Times New Roman" w:cs="Times New Roman"/>
+        </w:rPr>
+        <w:t>convolution speedup.</w:t>
+      </w:r>
+    </w:p>
+    <w:bookmarkEnd w:id="144"/>
+    <w:p>
+      <w:pPr>
+        <w:pStyle w:val="BodyText"/>
+        <w:spacing w:line="360" w:lineRule="auto"/>
+        <w:jc w:val="both"/>
+      </w:pPr>
+      <w:r>
+        <w:rPr>
+          <w:rFonts w:ascii="Times New Roman" w:hAnsi="Times New Roman" w:cs="Times New Roman"/>
+        </w:rPr>
+        <w:t>The board evidence therefore supports two claims directly: the custom-instruction accelerator produces the same reduced-convolution result as the CPU reference, and the measured kernel execution is 5.282</w:t>
       </w:r>
       <m:oMath>
         <m:r>
@@ -21159,54 +21093,57 @@
         <w:rPr>
           <w:rFonts w:ascii="Times New Roman" w:hAnsi="Times New Roman" w:cs="Times New Roman"/>
         </w:rPr>
-        <w:t>4 input feature map:</w:t>
-      </w:r>
-    </w:p>
-    <w:p>
-      <w:pPr>
-        <w:numPr>
-          <w:ilvl w:val="0"/>
-          <w:numId w:val="1002"/>
-        </w:numPr>
-        <w:spacing w:line="360" w:lineRule="auto"/>
-        <w:jc w:val="both"/>
-      </w:pPr>
-      <w:r>
-        <w:rPr>
-          <w:rFonts w:ascii="Times New Roman" w:hAnsi="Times New Roman" w:cs="Times New Roman"/>
-        </w:rPr>
-        <w:t>CPU-only (software): 1,516 clock cycles</w:t>
-      </w:r>
-    </w:p>
-    <w:p>
-      <w:pPr>
-        <w:numPr>
-          <w:ilvl w:val="0"/>
-          <w:numId w:val="1002"/>
-        </w:numPr>
-        <w:spacing w:line="360" w:lineRule="auto"/>
-        <w:jc w:val="both"/>
-      </w:pPr>
-      <w:r>
-        <w:rPr>
-          <w:rFonts w:ascii="Times New Roman" w:hAnsi="Times New Roman" w:cs="Times New Roman"/>
-        </w:rPr>
-        <w:t>NICE-accelerated (hardware): 287 clock cycles</w:t>
-      </w:r>
-    </w:p>
-    <w:p>
-      <w:pPr>
-        <w:numPr>
-          <w:ilvl w:val="0"/>
-          <w:numId w:val="1002"/>
-        </w:numPr>
-        <w:spacing w:line="360" w:lineRule="auto"/>
-      </w:pPr>
-      <w:r>
-        <w:rPr>
-          <w:rFonts w:ascii="Times New Roman" w:hAnsi="Times New Roman" w:cs="Times New Roman"/>
-        </w:rPr>
-        <w:t>Speedup: 5.28</w:t>
+        <w:t xml:space="preserve"> </w:t>
+      </w:r>
+      <w:r>
+        <w:rPr>
+          <w:rFonts w:ascii="Times New Roman" w:hAnsi="Times New Roman" w:cs="Times New Roman"/>
+        </w:rPr>
+        <w:t>faster than the software baseline. The LeNet-5 C implementation and INT8 quantization flow remain useful system-integration context, but the final board transcript used in this thesis is deliberately scoped to the reproducible CNN v1 convolution regression.</w:t>
+      </w:r>
+    </w:p>
+    <w:bookmarkEnd w:id="145"/>
+    <w:bookmarkEnd w:id="146"/>
+    <w:bookmarkStart w:id="151" w:name="performance-measurement"/>
+    <w:p>
+      <w:pPr>
+        <w:pStyle w:val="Heading3"/>
+        <w:spacing w:line="360" w:lineRule="auto"/>
+      </w:pPr>
+      <w:r>
+        <w:rPr>
+          <w:rStyle w:val="SectionNumber"/>
+          <w:rFonts w:ascii="Times New Roman" w:hAnsi="Times New Roman" w:cs="Times New Roman"/>
+          <w:sz w:val="26"/>
+        </w:rPr>
+        <w:t>4.5.5</w:t>
+      </w:r>
+      <w:r>
+        <w:rPr>
+          <w:rFonts w:ascii="Times New Roman" w:hAnsi="Times New Roman" w:cs="Times New Roman"/>
+          <w:sz w:val="26"/>
+        </w:rPr>
+        <w:tab/>
+      </w:r>
+      <w:r>
+        <w:rPr>
+          <w:rFonts w:ascii="Times New Roman" w:hAnsi="Times New Roman" w:cs="Times New Roman"/>
+          <w:sz w:val="26"/>
+        </w:rPr>
+        <w:t>Performance Measurement</w:t>
+      </w:r>
+    </w:p>
+    <w:p>
+      <w:pPr>
+        <w:pStyle w:val="FirstParagraph"/>
+        <w:spacing w:line="360" w:lineRule="auto"/>
+        <w:jc w:val="both"/>
+      </w:pPr>
+      <w:r>
+        <w:rPr>
+          <w:rFonts w:ascii="Times New Roman" w:hAnsi="Times New Roman" w:cs="Times New Roman"/>
+        </w:rPr>
+        <w:t>The NICE-accelerated convolution was benchmarked against a pure software reference implementation. For a 3</w:t>
       </w:r>
       <m:oMath>
         <m:r>
@@ -21216,27 +21153,11 @@
           <m:t>×</m:t>
         </m:r>
       </m:oMath>
-    </w:p>
-    <w:bookmarkStart w:id="150" w:name="fig:4_3"/>
-    <w:p>
-      <w:pPr>
-        <w:pStyle w:val="CaptionedFigure"/>
-      </w:pPr>
-      <w:r>
-        <w:rPr>
-          <w:rFonts w:ascii="Times New Roman" w:hAnsi="Times New Roman" w:cs="Times New Roman"/>
-        </w:rPr>
-      </w:r>
-    </w:p>
-    <w:p>
-      <w:pPr>
-        <w:pStyle w:val="ImageCaption"/>
-      </w:pPr>
-      <w:r>
-        <w:rPr>
-          <w:rFonts w:ascii="Times New Roman" w:hAnsi="Times New Roman" w:cs="Times New Roman"/>
-        </w:rPr>
-        <w:t>Measured convolution benchmark on the board demo: the NICE accelerator completes the test convolution in 287 cycles versus 1,516 cycles for the CPU reference, giving a 5.282</w:t>
+      <w:r>
+        <w:rPr>
+          <w:rFonts w:ascii="Times New Roman" w:hAnsi="Times New Roman" w:cs="Times New Roman"/>
+        </w:rPr>
+        <w:t>3 convolution on a 4</w:t>
       </w:r>
       <m:oMath>
         <m:r>
@@ -21250,40 +21171,54 @@
         <w:rPr>
           <w:rFonts w:ascii="Times New Roman" w:hAnsi="Times New Roman" w:cs="Times New Roman"/>
         </w:rPr>
-        <w:t xml:space="preserve"> </w:t>
-      </w:r>
-      <w:r>
-        <w:rPr>
-          <w:rFonts w:ascii="Times New Roman" w:hAnsi="Times New Roman" w:cs="Times New Roman"/>
-        </w:rPr>
-        <w:t>speedup.</w:t>
-      </w:r>
-    </w:p>
-    <w:bookmarkEnd w:id="150"/>
-    <w:p>
-      <w:pPr>
-        <w:pStyle w:val="BodyText"/>
-        <w:spacing w:line="360" w:lineRule="auto"/>
-        <w:jc w:val="both"/>
-      </w:pPr>
-      <w:r>
-        <w:rPr>
-          <w:rFonts w:ascii="Times New Roman" w:hAnsi="Times New Roman" w:cs="Times New Roman"/>
-        </w:rPr>
-        <w:t>This measurement covers the convolution operation only: CLEAR, four WLOADs, four DLOADs, COMP, and RSTAT. The overall LeNet-5 inference time is dominated by the software FC layers, which perform approximately 50,000 multiply-accumulate operations per image at 16 MHz. The complete inference time per image is approximately 2–5 minutes in the current implementation, indicating that future work should target hardware acceleration of the FC layers, adoption of a Line Buffer architecture for pipelined data supply (as specified in the original task requirements), or migration to a reduced-precision FC datapath.</w:t>
-      </w:r>
-    </w:p>
-    <w:p>
-      <w:pPr>
-        <w:pStyle w:val="BodyText"/>
-        <w:spacing w:line="360" w:lineRule="auto"/>
-        <w:jc w:val="both"/>
-      </w:pPr>
-      <w:r>
-        <w:rPr>
-          <w:rFonts w:ascii="Times New Roman" w:hAnsi="Times New Roman" w:cs="Times New Roman"/>
-        </w:rPr>
-        <w:t>The measured 5.28</w:t>
+        <w:t>4 input feature map:</w:t>
+      </w:r>
+    </w:p>
+    <w:p>
+      <w:pPr>
+        <w:numPr>
+          <w:ilvl w:val="0"/>
+          <w:numId w:val="1002"/>
+        </w:numPr>
+        <w:spacing w:line="360" w:lineRule="auto"/>
+        <w:jc w:val="both"/>
+      </w:pPr>
+      <w:r>
+        <w:rPr>
+          <w:rFonts w:ascii="Times New Roman" w:hAnsi="Times New Roman" w:cs="Times New Roman"/>
+        </w:rPr>
+        <w:t>CPU-only (software): 1,516 clock cycles</w:t>
+      </w:r>
+    </w:p>
+    <w:p>
+      <w:pPr>
+        <w:numPr>
+          <w:ilvl w:val="0"/>
+          <w:numId w:val="1002"/>
+        </w:numPr>
+        <w:spacing w:line="360" w:lineRule="auto"/>
+        <w:jc w:val="both"/>
+      </w:pPr>
+      <w:r>
+        <w:rPr>
+          <w:rFonts w:ascii="Times New Roman" w:hAnsi="Times New Roman" w:cs="Times New Roman"/>
+        </w:rPr>
+        <w:t>NICE-accelerated (hardware): 287 clock cycles</w:t>
+      </w:r>
+    </w:p>
+    <w:p>
+      <w:pPr>
+        <w:numPr>
+          <w:ilvl w:val="0"/>
+          <w:numId w:val="1002"/>
+        </w:numPr>
+        <w:spacing w:line="360" w:lineRule="auto"/>
+      </w:pPr>
+      <w:r>
+        <w:rPr>
+          <w:rFonts w:ascii="Times New Roman" w:hAnsi="Times New Roman" w:cs="Times New Roman"/>
+        </w:rPr>
+        <w:t>Speedup: 5.28</w:t>
       </w:r>
       <m:oMath>
         <m:r>
@@ -21293,6 +21228,83 @@
           <m:t>×</m:t>
         </m:r>
       </m:oMath>
+    </w:p>
+    <w:bookmarkStart w:id="150" w:name="fig:4_3"/>
+    <w:p>
+      <w:pPr>
+        <w:pStyle w:val="CaptionedFigure"/>
+      </w:pPr>
+      <w:r>
+        <w:rPr>
+          <w:rFonts w:ascii="Times New Roman" w:hAnsi="Times New Roman" w:cs="Times New Roman"/>
+        </w:rPr>
+      </w:r>
+    </w:p>
+    <w:p>
+      <w:pPr>
+        <w:pStyle w:val="ImageCaption"/>
+      </w:pPr>
+      <w:r>
+        <w:rPr>
+          <w:rFonts w:ascii="Times New Roman" w:hAnsi="Times New Roman" w:cs="Times New Roman"/>
+        </w:rPr>
+        <w:t>Measured convolution benchmark on the board demo: the NICE accelerator completes the test convolution in 287 cycles versus 1,516 cycles for the CPU reference, giving a 5.282</w:t>
+      </w:r>
+      <m:oMath>
+        <m:r>
+          <m:rPr>
+            <m:sty m:val="p"/>
+          </m:rPr>
+          <m:t>×</m:t>
+        </m:r>
+      </m:oMath>
+      <w:r>
+        <w:rPr>
+          <w:rFonts w:ascii="Times New Roman" w:hAnsi="Times New Roman" w:cs="Times New Roman"/>
+        </w:rPr>
+        <w:t xml:space="preserve"> </w:t>
+      </w:r>
+      <w:r>
+        <w:rPr>
+          <w:rFonts w:ascii="Times New Roman" w:hAnsi="Times New Roman" w:cs="Times New Roman"/>
+        </w:rPr>
+        <w:t>speedup.</w:t>
+      </w:r>
+    </w:p>
+    <w:bookmarkEnd w:id="150"/>
+    <w:p>
+      <w:pPr>
+        <w:pStyle w:val="BodyText"/>
+        <w:spacing w:line="360" w:lineRule="auto"/>
+        <w:jc w:val="both"/>
+      </w:pPr>
+      <w:r>
+        <w:rPr>
+          <w:rFonts w:ascii="Times New Roman" w:hAnsi="Times New Roman" w:cs="Times New Roman"/>
+        </w:rPr>
+        <w:t>This measurement covers the convolution operation only: CLEAR, four WLOADs, four DLOADs, COMP, and RSTAT. The overall LeNet-5 inference time is dominated by the software FC layers, which perform approximately 50,000 multiply-accumulate operations per image at 16 MHz. The complete inference time per image is approximately 2–5 minutes in the current implementation, indicating that future work should target hardware acceleration of the FC layers, adoption of a Line Buffer architecture for pipelined data supply (as specified in the original task requirements), or migration to a reduced-precision FC datapath.</w:t>
+      </w:r>
+    </w:p>
+    <w:p>
+      <w:pPr>
+        <w:pStyle w:val="BodyText"/>
+        <w:spacing w:line="360" w:lineRule="auto"/>
+        <w:jc w:val="both"/>
+      </w:pPr>
+      <w:r>
+        <w:rPr>
+          <w:rFonts w:ascii="Times New Roman" w:hAnsi="Times New Roman" w:cs="Times New Roman"/>
+        </w:rPr>
+        <w:t>The measured 5.28</w:t>
+      </w:r>
+      <m:oMath>
+        <m:r>
+          <m:rPr>
+            <m:sty m:val="p"/>
+          </m:rPr>
+          <m:t>×</m:t>
+        </m:r>
+      </m:oMath>
       <w:r>
         <w:rPr>
           <w:rFonts w:ascii="Times New Roman" w:hAnsi="Times New Roman" w:cs="Times New Roman"/>
@@ -21441,7 +21453,7 @@
         <w:rPr>
           <w:rFonts w:ascii="Times New Roman" w:hAnsi="Times New Roman" w:cs="Times New Roman"/>
         </w:rPr>
-        <w:t>(post-implementation, xc7a100tfgg484-2).</w:t>
+        <w:t>(post-implementation, xc7a100t).</w:t>
       </w:r>
     </w:p>
     <w:bookmarkStart w:id="153" w:name="tab:4_6"/>
@@ -21937,7 +21949,7 @@
         <w:rPr>
           <w:rFonts w:ascii="Times New Roman" w:hAnsi="Times New Roman" w:cs="Times New Roman"/>
         </w:rPr>
-        <w:t>FPGA resource utilization distribution for the complete E203 SoC with CNN NICE accelerator, showing that the implementation fits comfortably in the A7-100T device.</w:t>
+        <w:t>FPGA resource-capacity fit for the complete E203 SoC with CNN NICE accelerator. Each horizontal bar is scaled against its own Vivado resource capacity, showing that the implementation fits comfortably in the A7-100T device.</w:t>
       </w:r>
     </w:p>
     <w:bookmarkEnd w:id="157"/>
@@ -22205,7 +22217,7 @@
         <w:rPr>
           <w:rFonts w:ascii="Times New Roman" w:hAnsi="Times New Roman" w:cs="Times New Roman"/>
         </w:rPr>
-        <w:t>interpret whitespace-separated hex tokens as full memory words. Combined with the E203’s use of different data widths for ITCM (64-bit) and DTCM (32-bit), this created a subtle but critical initialization bug. The</w:t>
+        <w:t>interpret whitespace-separated hex tokens as full memory words. Combined with the E203’s use of different data widths for ITCM (64-bit) and DTCM (32-bit), this created a subtle but critical initialization bug. The RISC-V</w:t>
       </w:r>
       <w:r>
         <w:rPr>
@@ -22218,13 +22230,25 @@
           <w:rStyle w:val="VerbatimChar"/>
           <w:rFonts w:ascii="Times New Roman" w:hAnsi="Times New Roman" w:cs="Times New Roman"/>
         </w:rPr>
-        <w:t>riscv64-unknown-elf-objcopy</w:t>
-      </w:r>
-      <w:r>
-        <w:rPr>
-          <w:rFonts w:ascii="Times New Roman" w:hAnsi="Times New Roman" w:cs="Times New Roman"/>
-        </w:rPr>
-        <w:t xml:space="preserve"> </w:t>
+        <w:t>objcopy</w:t>
+      </w:r>
+      <w:r>
+        <w:rPr>
+          <w:rFonts w:ascii="Times New Roman" w:hAnsi="Times New Roman" w:cs="Times New Roman"/>
+        </w:rPr>
+        <w:t xml:space="preserve"> </w:t>
+      </w:r>
+      <w:r>
+        <w:rPr>
+          <w:rFonts w:ascii="Times New Roman" w:hAnsi="Times New Roman" w:cs="Times New Roman"/>
+        </w:rPr>
+        <w:t>command with</w:t>
+      </w:r>
+      <w:r>
+        <w:rPr>
+          <w:rFonts w:ascii="Times New Roman" w:hAnsi="Times New Roman" w:cs="Times New Roman"/>
+        </w:rPr>
+        <w:t xml:space="preserve"> </w:t>
       </w:r>
       <w:r>
         <w:rPr>
@@ -22243,7 +22267,7 @@
         <w:rPr>
           <w:rFonts w:ascii="Times New Roman" w:hAnsi="Times New Roman" w:cs="Times New Roman"/>
         </w:rPr>
-        <w:t>command produces byte-level hex, incompatible with word-level</w:t>
+        <w:t>output produces byte-level hex, incompatible with word-level</w:t>
       </w:r>
       <w:r>
         <w:rPr>
@@ -22582,20 +22606,7 @@
         <w:rPr>
           <w:rFonts w:ascii="Times New Roman" w:hAnsi="Times New Roman" w:cs="Times New Roman"/>
         </w:rPr>
-        <w:t>A complete LeNet-5 inference pipeline was deployed and validated on the FPGA using 10 MNIST test images, achieving correct classification on all 10 images (100%), with 98.34% accuracy measured on the full 10,000-image MNIST test set via a Python reference model (versus a 98.5% FP32 baseline). The convolutional layers (Conv1 and Conv2), executed entirely via the NICE accelerator, demonstrated functional correctness verified by per-pixel equivalence checks against a CPU reference implementation. The 1.7% accuracy gap is attributable to minor INT8 quantization loss in the fully-connected layers, well within the project’s 5% target. Two implementation corrections were key to restoring accuracy: (1) moving the Conv2 ReLU activation from per-input-channel application to after multi-channel summation, and (2) replacing uniform hard-coded rescaling shifts with per-layer calibrated factors generated by the Python quantization toolchain.</w:t>
-      </w:r>
-    </w:p>
-    <w:p>
-      <w:pPr>
-        <w:pStyle w:val="BodyText"/>
-        <w:spacing w:line="360" w:lineRule="auto"/>
-        <w:jc w:val="both"/>
-      </w:pPr>
-      <w:r>
-        <w:rPr>
-          <w:rFonts w:ascii="Times New Roman" w:hAnsi="Times New Roman" w:cs="Times New Roman"/>
-        </w:rPr>
-        <w:t>In the multi-tile convolution mode used for 5</w:t>
+        <w:t>The final board-level CNN regression used a reduced 3</w:t>
       </w:r>
       <m:oMath>
         <m:r>
@@ -22609,7 +22620,54 @@
         <w:rPr>
           <w:rFonts w:ascii="Times New Roman" w:hAnsi="Times New Roman" w:cs="Times New Roman"/>
         </w:rPr>
-        <w:t>5 kernels, the RSTAT readback was validated through per-tile CPU-side reference comparison embedded in the firmware, confirming correct accelerator computation. The per-tile accumulation approach successfully enables correct end-to-end inference with the NICE accelerator.</w:t>
+        <w:t>3 INT8 convolution over a 4</w:t>
+      </w:r>
+      <m:oMath>
+        <m:r>
+          <m:rPr>
+            <m:sty m:val="p"/>
+          </m:rPr>
+          <m:t>×</m:t>
+        </m:r>
+      </m:oMath>
+      <w:r>
+        <w:rPr>
+          <w:rFonts w:ascii="Times New Roman" w:hAnsi="Times New Roman" w:cs="Times New Roman"/>
+        </w:rPr>
+        <w:t>4 INT8 input. Its UART transcript shows that the NICE hardware output exactly matches both the CPU reference and the expected result (12, 23, 0, 19), and the same run reports a 5.282</w:t>
+      </w:r>
+      <m:oMath>
+        <m:r>
+          <m:rPr>
+            <m:sty m:val="p"/>
+          </m:rPr>
+          <m:t>×</m:t>
+        </m:r>
+      </m:oMath>
+      <w:r>
+        <w:rPr>
+          <w:rFonts w:ascii="Times New Roman" w:hAnsi="Times New Roman" w:cs="Times New Roman"/>
+        </w:rPr>
+        <w:t xml:space="preserve"> </w:t>
+      </w:r>
+      <w:r>
+        <w:rPr>
+          <w:rFonts w:ascii="Times New Roman" w:hAnsi="Times New Roman" w:cs="Times New Roman"/>
+        </w:rPr>
+        <w:t>kernel speedup. This scopes the hardware claim to a reproducible board test while still exercising the custom instruction path, PE array datapath, result readback, and rs2 decoder fix.</w:t>
+      </w:r>
+    </w:p>
+    <w:p>
+      <w:pPr>
+        <w:pStyle w:val="BodyText"/>
+        <w:spacing w:line="360" w:lineRule="auto"/>
+        <w:jc w:val="both"/>
+      </w:pPr>
+      <w:r>
+        <w:rPr>
+          <w:rFonts w:ascii="Times New Roman" w:hAnsi="Times New Roman" w:cs="Times New Roman"/>
+        </w:rPr>
+        <w:t>The larger LeNet-5 software and quantization flow remains a natural extension point, but the evidence package deliberately separates those software artifacts from the board transcript. This prevents the thesis from overstating what the recorded UART and ILA captures directly prove.</w:t>
       </w:r>
     </w:p>
     <w:bookmarkEnd w:id="173"/>
@@ -22749,7 +22807,18 @@
               <w:jc w:val="left"/>
             </w:pPr>
             <w:r>
-              <w:t xml:space="preserve">Design 4×4 PE array with NICE interface</w:t>
+              <w:t xml:space="preserve">Design 4</w:t>
+            </w:r>
+            <m:oMath>
+              <m:r>
+                <m:rPr>
+                  <m:sty m:val="p"/>
+                </m:rPr>
+                <m:t>×</m:t>
+              </m:r>
+            </m:oMath>
+            <w:r>
+              <w:t xml:space="preserve">4 PE array with NICE interface</w:t>
             </w:r>
           </w:p>
         </w:tc>
@@ -22925,7 +22994,7 @@
               <w:jc w:val="left"/>
             </w:pPr>
             <w:r>
-              <w:t xml:space="preserve">ILA-confirmed instruction execution + LeNet-5 pipeline</w:t>
+              <w:t xml:space="preserve">ILA-confirmed instruction execution + CNN v1 UART regression</w:t>
             </w:r>
           </w:p>
         </w:tc>
@@ -23016,7 +23085,7 @@
               <w:jc w:val="left"/>
             </w:pPr>
             <w:r>
-              <w:t xml:space="preserve">Accuracy validation (MNIST/LeNet-5)</w:t>
+              <w:t xml:space="preserve">Full-network accuracy validation</w:t>
             </w:r>
           </w:p>
         </w:tc>
@@ -23028,7 +23097,7 @@
               <w:jc w:val="left"/>
             </w:pPr>
             <w:r>
-              <w:t xml:space="preserve">Achieved</w:t>
+              <w:t xml:space="preserve">Partial</w:t>
             </w:r>
           </w:p>
         </w:tc>
@@ -23040,7 +23109,7 @@
               <w:jc w:val="left"/>
             </w:pPr>
             <w:r>
-              <w:t xml:space="preserve">98.34% accuracy; 1.7% gap from FP32 baseline</w:t>
+              <w:t xml:space="preserve">LeNet-5 flow prepared; final board evidence scoped to reduced CNN regression</w:t>
             </w:r>
           </w:p>
         </w:tc>
@@ -23223,7 +23292,7 @@
         <w:rPr>
           <w:rFonts w:ascii="Times New Roman" w:hAnsi="Times New Roman" w:cs="Times New Roman"/>
         </w:rPr>
-        <w:t>The INT8-quantized LeNet-5 achieves 98.34% classification accuracy on the full MNIST test set (10,000 images), compared to a 98.5% FP32 baseline—a degradation of only 1.7%, well within the project’s 5% accuracy loss target. On the FPGA board, the inference pipeline correctly classified all 10 of 10 test images. The minor accuracy gap is attributable to INT8 quantization loss in the fully-connected layers and can be addressed in future work through quantization-aware training.</w:t>
+        <w:t>The current board evidence validates a reduced CNN convolution regression rather than a full MNIST classification run. Full-network LeNet-5 accuracy should therefore be treated as a follow-up validation task unless a separate, recorded board transcript is added to the evidence package. Quantization-aware training and a documented MNIST board test would be the appropriate next steps for closing this gap.</w:t>
       </w:r>
     </w:p>
     <w:p>
@@ -23263,7 +23332,7 @@
         <w:rPr>
           <w:rFonts w:ascii="Times New Roman" w:hAnsi="Times New Roman" w:cs="Times New Roman"/>
         </w:rPr>
-        <w:t>These limitations are clearly scoped and do not undermine the core contributions of the project: the complete FPGA bring-up pipeline, the systematic debugging methodology, the demonstrated execution of NICE custom instructions on FPGA hardware, and the end-to-end LeNet-5 inference validation achieving 98.34% accuracy on real MNIST test images with all 10 FPGA board tests classified correctly.</w:t>
+        <w:t>These limitations are clearly scoped and do not undermine the core contributions of the project: the complete FPGA bring-up pipeline, the systematic debugging methodology, the demonstrated execution of NICE custom instructions on FPGA hardware, and the recorded CNN v1 board regression with hardware/software result agreement and measured convolution speedup.</w:t>
       </w:r>
     </w:p>
     <w:bookmarkEnd w:id="177"/>
@@ -23385,197 +23454,7 @@
         <w:rPr>
           <w:rFonts w:ascii="Times New Roman" w:hAnsi="Times New Roman" w:cs="Times New Roman"/>
         </w:rPr>
-        <w:t>CNN Accelerator Design: A 4×4 systolic PE array supporting INT8 quantized convolution was implemented with six custom NICE instructions (CFG, CLEAR, WLOAD, DLOAD, COMP, RSTAT). The design was verified through RTL simulation achieving correct RSTAT results for validated test vectors.</w:t>
-      </w:r>
-    </w:p>
-    <w:p>
-      <w:pPr>
-        <w:pStyle w:val="BodyText"/>
-        <w:spacing w:line="360" w:lineRule="auto"/>
-        <w:jc w:val="both"/>
-      </w:pPr>
-      <w:r>
-        <w:rPr>
-          <w:rFonts w:ascii="Times New Roman" w:hAnsi="Times New Roman" w:cs="Times New Roman"/>
-        </w:rPr>
-        <w:t>Complete FPGA Bring-up Pipeline: A reproducible build flow was established from RTL source through Vivado synthesis, place-and-route, and bitstream generation for the Davinci Pro A7-100T development board. Six ILA diagnostic build modes were created to support progressive hardware debugging. All builds achieved clean timing closure (WNS &gt; 12 ns, WHS &gt; 0.05 ns).</w:t>
-      </w:r>
-    </w:p>
-    <w:p>
-      <w:pPr>
-        <w:pStyle w:val="BodyText"/>
-        <w:spacing w:line="360" w:lineRule="auto"/>
-        <w:jc w:val="both"/>
-      </w:pPr>
-      <w:r>
-        <w:rPr>
-          <w:rFonts w:ascii="Times New Roman" w:hAnsi="Times New Roman" w:cs="Times New Roman"/>
-        </w:rPr>
-        <w:t>Hello World Board Validation: The hello_e203 bare-metal program was successfully executed on the FPGA, producing the expected three-stage UART output and confirming the complete CPU boot chain from mask ROM through ITCM execution.</w:t>
-      </w:r>
-    </w:p>
-    <w:p>
-      <w:pPr>
-        <w:pStyle w:val="BodyText"/>
-        <w:spacing w:line="360" w:lineRule="auto"/>
-        <w:jc w:val="both"/>
-      </w:pPr>
-      <w:r>
-        <w:rPr>
-          <w:rFonts w:ascii="Times New Roman" w:hAnsi="Times New Roman" w:cs="Times New Roman"/>
-        </w:rPr>
-        <w:t>Systematic Root Cause Analysis: Four critical root causes preventing CPU boot were identified and resolved through a systematic ILA-based debugging methodology: simulation DFF transport delay, ITCM/DTCM hex format incompatibility, and macro visibility in Vivado synthesis. The simulation environment was demonstrated to exactly reproduce FPGA board behavior, enabling rapid diagnosis.</w:t>
-      </w:r>
-    </w:p>
-    <w:p>
-      <w:pPr>
-        <w:pStyle w:val="BodyText"/>
-        <w:spacing w:line="360" w:lineRule="auto"/>
-        <w:jc w:val="both"/>
-      </w:pPr>
-      <w:r>
-        <w:rPr>
-          <w:rFonts w:ascii="Times New Roman" w:hAnsi="Times New Roman" w:cs="Times New Roman"/>
-        </w:rPr>
-        <w:t>NICE Accelerator Board Testing: Custom NICE test programs confirmed that the CNN accelerator instructions execute correctly on the FPGA, with ILA evidence documenting the complete instruction execution sequence. An end-to-end LeNet-5 inference pipeline was validated on the FPGA, achieving correct classification on all 10 of 10 MNIST test images, with 98.34% accuracy on the full MNIST test set (10,000 images). The INT8-quantized inference accuracy is within 1.7% of the FP32 baseline, well under the project’s 5% accuracy loss target.</w:t>
-      </w:r>
-    </w:p>
-    <w:bookmarkEnd w:id="179"/>
-    <w:bookmarkStart w:id="180" w:name="sec:6_2"/>
-    <w:p>
-      <w:pPr>
-        <w:pStyle w:val="Heading2"/>
-        <w:spacing w:line="360" w:lineRule="auto"/>
-      </w:pPr>
-      <w:r>
-        <w:rPr>
-          <w:rStyle w:val="SectionNumber"/>
-          <w:rFonts w:ascii="Times New Roman" w:hAnsi="Times New Roman" w:cs="Times New Roman"/>
-          <w:sz w:val="28"/>
-        </w:rPr>
-        <w:t>6.2</w:t>
-      </w:r>
-      <w:r>
-        <w:rPr>
-          <w:rFonts w:ascii="Times New Roman" w:hAnsi="Times New Roman" w:cs="Times New Roman"/>
-          <w:sz w:val="28"/>
-        </w:rPr>
-        <w:tab/>
-      </w:r>
-      <w:r>
-        <w:rPr>
-          <w:rFonts w:ascii="Times New Roman" w:hAnsi="Times New Roman" w:cs="Times New Roman"/>
-          <w:sz w:val="28"/>
-        </w:rPr>
-        <w:t>Key Technical Findings</w:t>
-      </w:r>
-    </w:p>
-    <w:p>
-      <w:pPr>
-        <w:pStyle w:val="FirstParagraph"/>
-        <w:spacing w:line="360" w:lineRule="auto"/>
-        <w:jc w:val="both"/>
-      </w:pPr>
-      <w:r>
-        <w:rPr>
-          <w:rFonts w:ascii="Times New Roman" w:hAnsi="Times New Roman" w:cs="Times New Roman"/>
-        </w:rPr>
-        <w:t>The project yielded several findings of general relevance to RISC-V SoC prototyping on FPGA platforms:</w:t>
-      </w:r>
-    </w:p>
-    <w:p>
-      <w:pPr>
-        <w:pStyle w:val="BodyText"/>
-        <w:spacing w:line="360" w:lineRule="auto"/>
-        <w:jc w:val="both"/>
-      </w:pPr>
-      <w:r>
-        <w:rPr>
-          <w:rFonts w:ascii="Times New Roman" w:hAnsi="Times New Roman" w:cs="Times New Roman"/>
-        </w:rPr>
-        <w:t>ITCM/DTCM initialization format is a critical compatibility point between the RISC-V toolchain (objcopy -O verilog) and FPGA synthesis tools ($readmemh). The byte-level hex format produced by objcopy is not directly compatible with word-level memory initialization for BRAM widths greater than 8 bits.</w:t>
-      </w:r>
-    </w:p>
-    <w:p>
-      <w:pPr>
-        <w:pStyle w:val="BodyText"/>
-        <w:spacing w:line="360" w:lineRule="auto"/>
-        <w:jc w:val="both"/>
-      </w:pPr>
-      <w:r>
-        <w:rPr>
-          <w:rFonts w:ascii="Times New Roman" w:hAnsi="Times New Roman" w:cs="Times New Roman"/>
-        </w:rPr>
-        <w:t>Macro visibility in Vivado’s Verilog compilation differs from standard Verilog simulators. Macros defined in header files may not be visible to modules that do not explicitly include them, even when all files are compiled in the same project.</w:t>
-      </w:r>
-    </w:p>
-    <w:p>
-      <w:pPr>
-        <w:pStyle w:val="BodyText"/>
-        <w:spacing w:line="360" w:lineRule="auto"/>
-        <w:jc w:val="both"/>
-      </w:pPr>
-      <w:r>
-        <w:rPr>
-          <w:rFonts w:ascii="Times New Roman" w:hAnsi="Times New Roman" w:cs="Times New Roman"/>
-        </w:rPr>
-        <w:t>ILA probe placement requires understanding of the complete bus architecture. Monitoring only the expected operational path (ITCM interface) can miss activity during boot sequences that use different bus paths (BIU → system memory bus).</w:t>
-      </w:r>
-    </w:p>
-    <w:bookmarkEnd w:id="180"/>
-    <w:bookmarkStart w:id="181" w:name="sec:6_3"/>
-    <w:p>
-      <w:pPr>
-        <w:pStyle w:val="Heading2"/>
-        <w:spacing w:line="360" w:lineRule="auto"/>
-      </w:pPr>
-      <w:r>
-        <w:rPr>
-          <w:rStyle w:val="SectionNumber"/>
-          <w:rFonts w:ascii="Times New Roman" w:hAnsi="Times New Roman" w:cs="Times New Roman"/>
-          <w:sz w:val="28"/>
-        </w:rPr>
-        <w:t>6.3</w:t>
-      </w:r>
-      <w:r>
-        <w:rPr>
-          <w:rFonts w:ascii="Times New Roman" w:hAnsi="Times New Roman" w:cs="Times New Roman"/>
-          <w:sz w:val="28"/>
-        </w:rPr>
-        <w:tab/>
-      </w:r>
-      <w:r>
-        <w:rPr>
-          <w:rFonts w:ascii="Times New Roman" w:hAnsi="Times New Roman" w:cs="Times New Roman"/>
-          <w:sz w:val="28"/>
-        </w:rPr>
-        <w:t>Future Work</w:t>
-      </w:r>
-    </w:p>
-    <w:p>
-      <w:pPr>
-        <w:pStyle w:val="FirstParagraph"/>
-        <w:spacing w:line="360" w:lineRule="auto"/>
-        <w:jc w:val="both"/>
-      </w:pPr>
-      <w:r>
-        <w:rPr>
-          <w:rFonts w:ascii="Times New Roman" w:hAnsi="Times New Roman" w:cs="Times New Roman"/>
-        </w:rPr>
-        <w:t>Several directions for extending this work are identified:</w:t>
-      </w:r>
-    </w:p>
-    <w:p>
-      <w:pPr>
-        <w:pStyle w:val="BodyText"/>
-        <w:spacing w:line="360" w:lineRule="auto"/>
-        <w:jc w:val="both"/>
-      </w:pPr>
-      <w:r>
-        <w:rPr>
-          <w:rFonts w:ascii="Times New Roman" w:hAnsi="Times New Roman" w:cs="Times New Roman"/>
-        </w:rPr>
-        <w:t>Hardware RSTAT Optimization: Optimize the multi-tile RSTAT readback path at the hardware level to reduce per-tile overhead, further improving convolution throughput for kernels larger than 4</w:t>
+        <w:t>CNN Accelerator Design: A 4</w:t>
       </w:r>
       <m:oMath>
         <m:r>
@@ -23589,6 +23468,244 @@
         <w:rPr>
           <w:rFonts w:ascii="Times New Roman" w:hAnsi="Times New Roman" w:cs="Times New Roman"/>
         </w:rPr>
+        <w:t>4 systolic PE array supporting INT8 quantized convolution was implemented with six custom NICE instructions (CFG, CLEAR, WLOAD, DLOAD, COMP, RSTAT). The design was verified through RTL simulation achieving correct RSTAT results for validated test vectors.</w:t>
+      </w:r>
+    </w:p>
+    <w:p>
+      <w:pPr>
+        <w:pStyle w:val="BodyText"/>
+        <w:spacing w:line="360" w:lineRule="auto"/>
+        <w:jc w:val="both"/>
+      </w:pPr>
+      <w:r>
+        <w:rPr>
+          <w:rFonts w:ascii="Times New Roman" w:hAnsi="Times New Roman" w:cs="Times New Roman"/>
+        </w:rPr>
+        <w:t>Complete FPGA Bring-up Pipeline: A reproducible build flow was established from RTL source through Vivado synthesis, place-and-route, and bitstream generation for the Davinci Pro A7-100T development board. Six ILA diagnostic build modes were created to support progressive hardware debugging. All builds achieved clean timing closure (WNS &gt; 12 ns, WHS &gt; 0.05 ns).</w:t>
+      </w:r>
+    </w:p>
+    <w:p>
+      <w:pPr>
+        <w:pStyle w:val="BodyText"/>
+        <w:spacing w:line="360" w:lineRule="auto"/>
+        <w:jc w:val="both"/>
+      </w:pPr>
+      <w:r>
+        <w:rPr>
+          <w:rFonts w:ascii="Times New Roman" w:hAnsi="Times New Roman" w:cs="Times New Roman"/>
+        </w:rPr>
+        <w:t>Hello World Board Validation: The hello_e203 bare-metal program was successfully executed on the FPGA, producing the expected three-stage UART output and confirming the complete CPU boot chain from mask ROM through ITCM execution.</w:t>
+      </w:r>
+    </w:p>
+    <w:p>
+      <w:pPr>
+        <w:pStyle w:val="BodyText"/>
+        <w:spacing w:line="360" w:lineRule="auto"/>
+        <w:jc w:val="both"/>
+      </w:pPr>
+      <w:r>
+        <w:rPr>
+          <w:rFonts w:ascii="Times New Roman" w:hAnsi="Times New Roman" w:cs="Times New Roman"/>
+        </w:rPr>
+        <w:t>Systematic Root Cause Analysis: Four critical root causes preventing CPU boot were identified and resolved through a systematic ILA-based debugging methodology: simulation DFF transport delay, ITCM/DTCM hex format incompatibility, and macro visibility in Vivado synthesis. The simulation environment was demonstrated to exactly reproduce FPGA board behavior, enabling rapid diagnosis.</w:t>
+      </w:r>
+    </w:p>
+    <w:p>
+      <w:pPr>
+        <w:pStyle w:val="BodyText"/>
+        <w:spacing w:line="360" w:lineRule="auto"/>
+        <w:jc w:val="both"/>
+      </w:pPr>
+      <w:r>
+        <w:rPr>
+          <w:rFonts w:ascii="Times New Roman" w:hAnsi="Times New Roman" w:cs="Times New Roman"/>
+        </w:rPr>
+        <w:t>NICE Accelerator Board Testing: Custom NICE test programs confirmed that the CNN accelerator instructions execute correctly on the FPGA, with ILA evidence documenting CPU execution and memory activity. The final CNN v1 board regression shows hardware/software agreement for a 3</w:t>
+      </w:r>
+      <m:oMath>
+        <m:r>
+          <m:rPr>
+            <m:sty m:val="p"/>
+          </m:rPr>
+          <m:t>×</m:t>
+        </m:r>
+      </m:oMath>
+      <w:r>
+        <w:rPr>
+          <w:rFonts w:ascii="Times New Roman" w:hAnsi="Times New Roman" w:cs="Times New Roman"/>
+        </w:rPr>
+        <w:t>3 INT8 convolution and reports a measured 5.282</w:t>
+      </w:r>
+      <m:oMath>
+        <m:r>
+          <m:rPr>
+            <m:sty m:val="p"/>
+          </m:rPr>
+          <m:t>×</m:t>
+        </m:r>
+      </m:oMath>
+      <w:r>
+        <w:rPr>
+          <w:rFonts w:ascii="Times New Roman" w:hAnsi="Times New Roman" w:cs="Times New Roman"/>
+        </w:rPr>
+        <w:t xml:space="preserve"> </w:t>
+      </w:r>
+      <w:r>
+        <w:rPr>
+          <w:rFonts w:ascii="Times New Roman" w:hAnsi="Times New Roman" w:cs="Times New Roman"/>
+        </w:rPr>
+        <w:t>speedup over the CPU reference.</w:t>
+      </w:r>
+    </w:p>
+    <w:bookmarkEnd w:id="179"/>
+    <w:bookmarkStart w:id="180" w:name="sec:6_2"/>
+    <w:p>
+      <w:pPr>
+        <w:pStyle w:val="Heading2"/>
+        <w:spacing w:line="360" w:lineRule="auto"/>
+      </w:pPr>
+      <w:r>
+        <w:rPr>
+          <w:rStyle w:val="SectionNumber"/>
+          <w:rFonts w:ascii="Times New Roman" w:hAnsi="Times New Roman" w:cs="Times New Roman"/>
+          <w:sz w:val="28"/>
+        </w:rPr>
+        <w:t>6.2</w:t>
+      </w:r>
+      <w:r>
+        <w:rPr>
+          <w:rFonts w:ascii="Times New Roman" w:hAnsi="Times New Roman" w:cs="Times New Roman"/>
+          <w:sz w:val="28"/>
+        </w:rPr>
+        <w:tab/>
+      </w:r>
+      <w:r>
+        <w:rPr>
+          <w:rFonts w:ascii="Times New Roman" w:hAnsi="Times New Roman" w:cs="Times New Roman"/>
+          <w:sz w:val="28"/>
+        </w:rPr>
+        <w:t>Key Technical Findings</w:t>
+      </w:r>
+    </w:p>
+    <w:p>
+      <w:pPr>
+        <w:pStyle w:val="FirstParagraph"/>
+        <w:spacing w:line="360" w:lineRule="auto"/>
+        <w:jc w:val="both"/>
+      </w:pPr>
+      <w:r>
+        <w:rPr>
+          <w:rFonts w:ascii="Times New Roman" w:hAnsi="Times New Roman" w:cs="Times New Roman"/>
+        </w:rPr>
+        <w:t>The project yielded several findings of general relevance to RISC-V SoC prototyping on FPGA platforms:</w:t>
+      </w:r>
+    </w:p>
+    <w:p>
+      <w:pPr>
+        <w:pStyle w:val="BodyText"/>
+        <w:spacing w:line="360" w:lineRule="auto"/>
+        <w:jc w:val="both"/>
+      </w:pPr>
+      <w:r>
+        <w:rPr>
+          <w:rFonts w:ascii="Times New Roman" w:hAnsi="Times New Roman" w:cs="Times New Roman"/>
+        </w:rPr>
+        <w:t>ITCM/DTCM initialization format is a critical compatibility point between the RISC-V toolchain (objcopy -O verilog) and FPGA synthesis tools ($readmemh). The byte-level hex format produced by objcopy is not directly compatible with word-level memory initialization for BRAM widths greater than 8 bits.</w:t>
+      </w:r>
+    </w:p>
+    <w:p>
+      <w:pPr>
+        <w:pStyle w:val="BodyText"/>
+        <w:spacing w:line="360" w:lineRule="auto"/>
+        <w:jc w:val="both"/>
+      </w:pPr>
+      <w:r>
+        <w:rPr>
+          <w:rFonts w:ascii="Times New Roman" w:hAnsi="Times New Roman" w:cs="Times New Roman"/>
+        </w:rPr>
+        <w:t>Macro visibility in Vivado’s Verilog compilation differs from standard Verilog simulators. Macros defined in header files may not be visible to modules that do not explicitly include them, even when all files are compiled in the same project.</w:t>
+      </w:r>
+    </w:p>
+    <w:p>
+      <w:pPr>
+        <w:pStyle w:val="BodyText"/>
+        <w:spacing w:line="360" w:lineRule="auto"/>
+        <w:jc w:val="both"/>
+      </w:pPr>
+      <w:r>
+        <w:rPr>
+          <w:rFonts w:ascii="Times New Roman" w:hAnsi="Times New Roman" w:cs="Times New Roman"/>
+        </w:rPr>
+        <w:t>ILA probe placement requires understanding of the complete bus architecture. Monitoring only the expected operational path (ITCM interface) can miss activity during boot sequences that use different bus paths (BIU to system memory bus).</w:t>
+      </w:r>
+    </w:p>
+    <w:bookmarkEnd w:id="180"/>
+    <w:bookmarkStart w:id="181" w:name="sec:6_3"/>
+    <w:p>
+      <w:pPr>
+        <w:pStyle w:val="Heading2"/>
+        <w:spacing w:line="360" w:lineRule="auto"/>
+      </w:pPr>
+      <w:r>
+        <w:rPr>
+          <w:rStyle w:val="SectionNumber"/>
+          <w:rFonts w:ascii="Times New Roman" w:hAnsi="Times New Roman" w:cs="Times New Roman"/>
+          <w:sz w:val="28"/>
+        </w:rPr>
+        <w:t>6.3</w:t>
+      </w:r>
+      <w:r>
+        <w:rPr>
+          <w:rFonts w:ascii="Times New Roman" w:hAnsi="Times New Roman" w:cs="Times New Roman"/>
+          <w:sz w:val="28"/>
+        </w:rPr>
+        <w:tab/>
+      </w:r>
+      <w:r>
+        <w:rPr>
+          <w:rFonts w:ascii="Times New Roman" w:hAnsi="Times New Roman" w:cs="Times New Roman"/>
+          <w:sz w:val="28"/>
+        </w:rPr>
+        <w:t>Future Work</w:t>
+      </w:r>
+    </w:p>
+    <w:p>
+      <w:pPr>
+        <w:pStyle w:val="FirstParagraph"/>
+        <w:spacing w:line="360" w:lineRule="auto"/>
+        <w:jc w:val="both"/>
+      </w:pPr>
+      <w:r>
+        <w:rPr>
+          <w:rFonts w:ascii="Times New Roman" w:hAnsi="Times New Roman" w:cs="Times New Roman"/>
+        </w:rPr>
+        <w:t>Several directions for extending this work are identified:</w:t>
+      </w:r>
+    </w:p>
+    <w:p>
+      <w:pPr>
+        <w:pStyle w:val="BodyText"/>
+        <w:spacing w:line="360" w:lineRule="auto"/>
+        <w:jc w:val="both"/>
+      </w:pPr>
+      <w:r>
+        <w:rPr>
+          <w:rFonts w:ascii="Times New Roman" w:hAnsi="Times New Roman" w:cs="Times New Roman"/>
+        </w:rPr>
+        <w:t>Hardware RSTAT Optimization: Optimize the multi-tile RSTAT readback path at the hardware level to reduce per-tile overhead, further improving convolution throughput for kernels larger than 4</w:t>
+      </w:r>
+      <m:oMath>
+        <m:r>
+          <m:rPr>
+            <m:sty m:val="p"/>
+          </m:rPr>
+          <m:t>×</m:t>
+        </m:r>
+      </m:oMath>
+      <w:r>
+        <w:rPr>
+          <w:rFonts w:ascii="Times New Roman" w:hAnsi="Times New Roman" w:cs="Times New Roman"/>
+        </w:rPr>
         <w:t>4.</w:t>
       </w:r>
     </w:p>
@@ -23602,7 +23719,7 @@
         <w:rPr>
           <w:rFonts w:ascii="Times New Roman" w:hAnsi="Times New Roman" w:cs="Times New Roman"/>
         </w:rPr>
-        <w:t>Accuracy Optimization: Explore quantization-aware training to close the remaining 1.7% accuracy gap between the INT8 FPGA inference pipeline and the FP32 baseline.</w:t>
+        <w:t>Accuracy Optimization: Complete a separately recorded full-network MNIST/LeNet-5 board validation flow, then explore quantization-aware training if the measured accuracy gap exceeds the project target.</w:t>
       </w:r>
     </w:p>
     <w:p>

</xml_diff>